<commit_message>
Mark unused habilitation symbols with an X in the legend table
The "Habilitations(1)" legend row lists every valid symbol for the type;
the real form's instruction is to cross out the ones that don't apply
("Barrer la mention inutile"). Since this is generated automatically, an
X is printed under each symbol NOT requested, leaving the requested
one(s) blank - same intent as crossing out, without needing a
handwritten strike-through.

- ST: adds a mark_<SYMBOL> tag under each of the 8 symbols in the real
  template's legend row.
- HT: adds an equivalent legend table (all 16 HT symbols, 2 rows of 8)
  with the same marking, plus the matching "(1) : Barrer la mention
  inutile." footnote and "Le champ d'application est comme suit :"
  heading before the growable table, mirroring the ST document's
  structure for consistency.

Co-Authored-By: Claude Sonnet 5 <noreply@anthropic.com>
Claude-Session: https://claude.ai/code/session_01Vv9yTc5WTYyhneR3pGmzMX
</commit_message>
<xml_diff>
--- a/server/templates/annexe_ST.docx
+++ b/server/templates/annexe_ST.docx
@@ -707,51 +707,16 @@
               <w:t>T</w:t>
             </w:r>
           </w:p>
-        </w:tc>
-        <w:tc>
-          <w:tcPr>
-            <w:tcW w:w="786" w:type="dxa"/>
-          </w:tcPr>
           <w:p>
-            <w:pPr>
-              <w:spacing w:before="120" w:after="120"/>
-              <w:jc w:val="center"/>
-              <w:rPr>
-                <w:rFonts w:ascii="Arial" w:hAnsi="Arial" w:cs="Arial"/>
-                <w:sz w:val="20"/>
-                <w:szCs w:val="20"/>
-              </w:rPr>
-            </w:pPr>
-            <w:r>
-              <w:rPr>
-                <w:rFonts w:ascii="Arial" w:hAnsi="Arial" w:cs="Arial"/>
-                <w:b/>
-                <w:bCs/>
-                <w:sz w:val="20"/>
-                <w:szCs w:val="20"/>
-              </w:rPr>
-              <w:t>B</w:t>
-            </w:r>
-            <w:r>
-              <w:rPr>
-                <w:rFonts w:ascii="Arial" w:hAnsi="Arial" w:cs="Arial"/>
-                <w:b/>
-                <w:bCs/>
-                <w:sz w:val="20"/>
-                <w:szCs w:val="20"/>
-                <w:vertAlign w:val="subscript"/>
-              </w:rPr>
-              <w:t>2</w:t>
-            </w:r>
-            <w:r>
-              <w:rPr>
-                <w:rFonts w:ascii="Arial" w:hAnsi="Arial" w:cs="Arial"/>
-                <w:b/>
-                <w:bCs/>
-                <w:sz w:val="20"/>
-                <w:szCs w:val="20"/>
-              </w:rPr>
-              <w:t>T</w:t>
+            <w:r>
+              <w:rPr>
+                <w:rFonts w:ascii="Arial" w:hAnsi="Arial" w:cs="Arial"/>
+                <w:b/>
+                <w:bCs/>
+                <w:sz w:val="20"/>
+                <w:szCs w:val="20"/>
+              </w:rPr>
+              <w:t xml:space="preserve">{mark_B1T}</w:t>
             </w:r>
           </w:p>
         </w:tc>
@@ -767,7 +732,6 @@
                 <w:rFonts w:ascii="Arial" w:hAnsi="Arial" w:cs="Arial"/>
                 <w:sz w:val="20"/>
                 <w:szCs w:val="20"/>
-                <w:lang w:val="de-DE"/>
               </w:rPr>
             </w:pPr>
             <w:r>
@@ -777,9 +741,8 @@
                 <w:bCs/>
                 <w:sz w:val="20"/>
                 <w:szCs w:val="20"/>
-                <w:lang w:val="de-DE"/>
-              </w:rPr>
-              <w:t>H</w:t>
+              </w:rPr>
+              <w:t>B</w:t>
             </w:r>
             <w:r>
               <w:rPr>
@@ -789,20 +752,30 @@
                 <w:sz w:val="20"/>
                 <w:szCs w:val="20"/>
                 <w:vertAlign w:val="subscript"/>
-                <w:lang w:val="de-DE"/>
-              </w:rPr>
-              <w:t>1</w:t>
-            </w:r>
-            <w:r>
-              <w:rPr>
-                <w:rFonts w:ascii="Arial" w:hAnsi="Arial" w:cs="Arial"/>
-                <w:b/>
-                <w:bCs/>
-                <w:sz w:val="20"/>
-                <w:szCs w:val="20"/>
-                <w:lang w:val="de-DE"/>
+              </w:rPr>
+              <w:t>2</w:t>
+            </w:r>
+            <w:r>
+              <w:rPr>
+                <w:rFonts w:ascii="Arial" w:hAnsi="Arial" w:cs="Arial"/>
+                <w:b/>
+                <w:bCs/>
+                <w:sz w:val="20"/>
+                <w:szCs w:val="20"/>
               </w:rPr>
               <w:t>T</w:t>
+            </w:r>
+          </w:p>
+          <w:p>
+            <w:r>
+              <w:rPr>
+                <w:rFonts w:ascii="Arial" w:hAnsi="Arial" w:cs="Arial"/>
+                <w:b/>
+                <w:bCs/>
+                <w:sz w:val="20"/>
+                <w:szCs w:val="20"/>
+              </w:rPr>
+              <w:t xml:space="preserve">{mark_B2T}</w:t>
             </w:r>
           </w:p>
         </w:tc>
@@ -816,8 +789,6 @@
               <w:jc w:val="center"/>
               <w:rPr>
                 <w:rFonts w:ascii="Arial" w:hAnsi="Arial" w:cs="Arial"/>
-                <w:b/>
-                <w:bCs/>
                 <w:sz w:val="20"/>
                 <w:szCs w:val="20"/>
                 <w:lang w:val="de-DE"/>
@@ -844,7 +815,7 @@
                 <w:vertAlign w:val="subscript"/>
                 <w:lang w:val="de-DE"/>
               </w:rPr>
-              <w:t>2</w:t>
+              <w:t>1</w:t>
             </w:r>
             <w:r>
               <w:rPr>
@@ -856,6 +827,18 @@
                 <w:lang w:val="de-DE"/>
               </w:rPr>
               <w:t>T</w:t>
+            </w:r>
+          </w:p>
+          <w:p>
+            <w:r>
+              <w:rPr>
+                <w:rFonts w:ascii="Arial" w:hAnsi="Arial" w:cs="Arial"/>
+                <w:b/>
+                <w:bCs/>
+                <w:sz w:val="20"/>
+                <w:szCs w:val="20"/>
+              </w:rPr>
+              <w:t xml:space="preserve">{mark_H1T}</w:t>
             </w:r>
           </w:p>
         </w:tc>
@@ -869,6 +852,8 @@
               <w:jc w:val="center"/>
               <w:rPr>
                 <w:rFonts w:ascii="Arial" w:hAnsi="Arial" w:cs="Arial"/>
+                <w:b/>
+                <w:bCs/>
                 <w:sz w:val="20"/>
                 <w:szCs w:val="20"/>
                 <w:lang w:val="de-DE"/>
@@ -883,7 +868,7 @@
                 <w:szCs w:val="20"/>
                 <w:lang w:val="de-DE"/>
               </w:rPr>
-              <w:t>B</w:t>
+              <w:t>H</w:t>
             </w:r>
             <w:r>
               <w:rPr>
@@ -895,7 +880,7 @@
                 <w:vertAlign w:val="subscript"/>
                 <w:lang w:val="de-DE"/>
               </w:rPr>
-              <w:t>1</w:t>
+              <w:t>2</w:t>
             </w:r>
             <w:r>
               <w:rPr>
@@ -906,7 +891,19 @@
                 <w:szCs w:val="20"/>
                 <w:lang w:val="de-DE"/>
               </w:rPr>
-              <w:t>N</w:t>
+              <w:t>T</w:t>
+            </w:r>
+          </w:p>
+          <w:p>
+            <w:r>
+              <w:rPr>
+                <w:rFonts w:ascii="Arial" w:hAnsi="Arial" w:cs="Arial"/>
+                <w:b/>
+                <w:bCs/>
+                <w:sz w:val="20"/>
+                <w:szCs w:val="20"/>
+              </w:rPr>
+              <w:t xml:space="preserve">{mark_H2T}</w:t>
             </w:r>
           </w:p>
         </w:tc>
@@ -922,6 +919,7 @@
                 <w:rFonts w:ascii="Arial" w:hAnsi="Arial" w:cs="Arial"/>
                 <w:sz w:val="20"/>
                 <w:szCs w:val="20"/>
+                <w:lang w:val="de-DE"/>
               </w:rPr>
             </w:pPr>
             <w:r>
@@ -931,6 +929,7 @@
                 <w:bCs/>
                 <w:sz w:val="20"/>
                 <w:szCs w:val="20"/>
+                <w:lang w:val="de-DE"/>
               </w:rPr>
               <w:t>B</w:t>
             </w:r>
@@ -942,18 +941,32 @@
                 <w:sz w:val="20"/>
                 <w:szCs w:val="20"/>
                 <w:vertAlign w:val="subscript"/>
-              </w:rPr>
-              <w:t>2</w:t>
-            </w:r>
-            <w:r>
-              <w:rPr>
-                <w:rFonts w:ascii="Arial" w:hAnsi="Arial" w:cs="Arial"/>
-                <w:b/>
-                <w:bCs/>
-                <w:sz w:val="20"/>
-                <w:szCs w:val="20"/>
+                <w:lang w:val="de-DE"/>
+              </w:rPr>
+              <w:t>1</w:t>
+            </w:r>
+            <w:r>
+              <w:rPr>
+                <w:rFonts w:ascii="Arial" w:hAnsi="Arial" w:cs="Arial"/>
+                <w:b/>
+                <w:bCs/>
+                <w:sz w:val="20"/>
+                <w:szCs w:val="20"/>
+                <w:lang w:val="de-DE"/>
               </w:rPr>
               <w:t>N</w:t>
+            </w:r>
+          </w:p>
+          <w:p>
+            <w:r>
+              <w:rPr>
+                <w:rFonts w:ascii="Arial" w:hAnsi="Arial" w:cs="Arial"/>
+                <w:b/>
+                <w:bCs/>
+                <w:sz w:val="20"/>
+                <w:szCs w:val="20"/>
+              </w:rPr>
+              <w:t xml:space="preserve">{mark_B1N}</w:t>
             </w:r>
           </w:p>
         </w:tc>
@@ -979,6 +992,65 @@
                 <w:sz w:val="20"/>
                 <w:szCs w:val="20"/>
               </w:rPr>
+              <w:t>B</w:t>
+            </w:r>
+            <w:r>
+              <w:rPr>
+                <w:rFonts w:ascii="Arial" w:hAnsi="Arial" w:cs="Arial"/>
+                <w:b/>
+                <w:bCs/>
+                <w:sz w:val="20"/>
+                <w:szCs w:val="20"/>
+                <w:vertAlign w:val="subscript"/>
+              </w:rPr>
+              <w:t>2</w:t>
+            </w:r>
+            <w:r>
+              <w:rPr>
+                <w:rFonts w:ascii="Arial" w:hAnsi="Arial" w:cs="Arial"/>
+                <w:b/>
+                <w:bCs/>
+                <w:sz w:val="20"/>
+                <w:szCs w:val="20"/>
+              </w:rPr>
+              <w:t>N</w:t>
+            </w:r>
+          </w:p>
+          <w:p>
+            <w:r>
+              <w:rPr>
+                <w:rFonts w:ascii="Arial" w:hAnsi="Arial" w:cs="Arial"/>
+                <w:b/>
+                <w:bCs/>
+                <w:sz w:val="20"/>
+                <w:szCs w:val="20"/>
+              </w:rPr>
+              <w:t xml:space="preserve">{mark_B2N}</w:t>
+            </w:r>
+          </w:p>
+        </w:tc>
+        <w:tc>
+          <w:tcPr>
+            <w:tcW w:w="786" w:type="dxa"/>
+          </w:tcPr>
+          <w:p>
+            <w:pPr>
+              <w:spacing w:before="120" w:after="120"/>
+              <w:jc w:val="center"/>
+              <w:rPr>
+                <w:rFonts w:ascii="Arial" w:hAnsi="Arial" w:cs="Arial"/>
+                <w:sz w:val="20"/>
+                <w:szCs w:val="20"/>
+              </w:rPr>
+            </w:pPr>
+            <w:r>
+              <w:rPr>
+                <w:rFonts w:ascii="Arial" w:hAnsi="Arial" w:cs="Arial"/>
+                <w:b/>
+                <w:bCs/>
+                <w:sz w:val="20"/>
+                <w:szCs w:val="20"/>
+              </w:rPr>
               <w:t>H</w:t>
             </w:r>
             <w:r>
@@ -1001,6 +1073,18 @@
                 <w:szCs w:val="20"/>
               </w:rPr>
               <w:t>N</w:t>
+            </w:r>
+          </w:p>
+          <w:p>
+            <w:r>
+              <w:rPr>
+                <w:rFonts w:ascii="Arial" w:hAnsi="Arial" w:cs="Arial"/>
+                <w:b/>
+                <w:bCs/>
+                <w:sz w:val="20"/>
+                <w:szCs w:val="20"/>
+              </w:rPr>
+              <w:t xml:space="preserve">{mark_H1N}</w:t>
             </w:r>
           </w:p>
         </w:tc>
@@ -1048,6 +1132,18 @@
                 <w:szCs w:val="20"/>
               </w:rPr>
               <w:t>N</w:t>
+            </w:r>
+          </w:p>
+          <w:p>
+            <w:r>
+              <w:rPr>
+                <w:rFonts w:ascii="Arial" w:hAnsi="Arial" w:cs="Arial"/>
+                <w:b/>
+                <w:bCs/>
+                <w:sz w:val="20"/>
+                <w:szCs w:val="20"/>
+              </w:rPr>
+              <w:t xml:space="preserve">{mark_H2N}</w:t>
             </w:r>
           </w:p>
         </w:tc>

</xml_diff>

<commit_message>
Strike through unused habilitation symbols instead of marking below them
Puts the "X" directly on the symbol code as a strike-through, matching
the form's own instruction literally ("Barrer la mention inutile" -
cross out the unused mention) instead of a separate mark line under the
code.

- ST (real template): each of the 8 legend cells now renders one of two
  pre-formatted variants of the same code - plain or struck-through -
  chosen via a boolean flag per symbol, since OOXML run formatting can't
  be toggled by a template tag directly.
- HT: same treatment on its 16-symbol legend, using the docx library's
  strike run property directly.

Co-Authored-By: Claude Sonnet 5 <noreply@anthropic.com>
Claude-Session: https://claude.ai/code/session_01Vv9yTc5WTYyhneR3pGmzMX
</commit_message>
<xml_diff>
--- a/server/templates/annexe_ST.docx
+++ b/server/templates/annexe_ST.docx
@@ -666,57 +666,58 @@
             <w:tcW w:w="786" w:type="dxa"/>
           </w:tcPr>
           <w:p>
-            <w:pPr>
-              <w:spacing w:before="120" w:after="120"/>
-              <w:jc w:val="center"/>
-              <w:rPr>
-                <w:rFonts w:ascii="Arial" w:hAnsi="Arial" w:cs="Arial"/>
-                <w:sz w:val="20"/>
-                <w:szCs w:val="20"/>
-              </w:rPr>
-            </w:pPr>
-            <w:r>
-              <w:rPr>
-                <w:rFonts w:ascii="Arial" w:hAnsi="Arial" w:cs="Arial"/>
-                <w:b/>
-                <w:bCs/>
-                <w:sz w:val="20"/>
-                <w:szCs w:val="20"/>
-              </w:rPr>
-              <w:t>B</w:t>
-            </w:r>
-            <w:r>
-              <w:rPr>
-                <w:rFonts w:ascii="Arial" w:hAnsi="Arial" w:cs="Arial"/>
-                <w:b/>
-                <w:bCs/>
-                <w:sz w:val="20"/>
-                <w:szCs w:val="20"/>
-                <w:vertAlign w:val="subscript"/>
-              </w:rPr>
-              <w:t>1</w:t>
-            </w:r>
-            <w:r>
-              <w:rPr>
-                <w:rFonts w:ascii="Arial" w:hAnsi="Arial" w:cs="Arial"/>
-                <w:b/>
-                <w:bCs/>
-                <w:sz w:val="20"/>
-                <w:szCs w:val="20"/>
-              </w:rPr>
-              <w:t>T</w:t>
-            </w:r>
-          </w:p>
-          <w:p>
-            <w:r>
-              <w:rPr>
-                <w:rFonts w:ascii="Arial" w:hAnsi="Arial" w:cs="Arial"/>
-                <w:b/>
-                <w:bCs/>
-                <w:sz w:val="20"/>
-                <w:szCs w:val="20"/>
-              </w:rPr>
-              <w:t xml:space="preserve">{mark_B1T}</w:t>
+            <w:r>
+              <w:rPr>
+                <w:rFonts w:ascii="Arial" w:hAnsi="Arial" w:cs="Arial"/>
+                <w:sz w:val="20"/>
+                <w:szCs w:val="20"/>
+              </w:rPr>
+              <w:t xml:space="preserve">{^unused_B1T}</w:t>
+            </w:r>
+            <w:r>
+              <w:rPr>
+                <w:rFonts w:ascii="Arial" w:hAnsi="Arial" w:cs="Arial"/>
+                <w:b/>
+                <w:bCs/>
+                <w:sz w:val="20"/>
+                <w:szCs w:val="20"/>
+              </w:rPr>
+              <w:t xml:space="preserve">B1T</w:t>
+            </w:r>
+            <w:r>
+              <w:rPr>
+                <w:rFonts w:ascii="Arial" w:hAnsi="Arial" w:cs="Arial"/>
+                <w:sz w:val="20"/>
+                <w:szCs w:val="20"/>
+              </w:rPr>
+              <w:t xml:space="preserve">{/unused_B1T}</w:t>
+            </w:r>
+            <w:r>
+              <w:rPr>
+                <w:rFonts w:ascii="Arial" w:hAnsi="Arial" w:cs="Arial"/>
+                <w:sz w:val="20"/>
+                <w:szCs w:val="20"/>
+              </w:rPr>
+              <w:t xml:space="preserve">{#unused_B1T}</w:t>
+            </w:r>
+            <w:r>
+              <w:rPr>
+                <w:rFonts w:ascii="Arial" w:hAnsi="Arial" w:cs="Arial"/>
+                <w:b/>
+                <w:bCs/>
+                <w:strike/>
+                <w:sz w:val="20"/>
+                <w:szCs w:val="20"/>
+              </w:rPr>
+              <w:t xml:space="preserve">B1T</w:t>
+            </w:r>
+            <w:r>
+              <w:rPr>
+                <w:rFonts w:ascii="Arial" w:hAnsi="Arial" w:cs="Arial"/>
+                <w:sz w:val="20"/>
+                <w:szCs w:val="20"/>
+              </w:rPr>
+              <w:t xml:space="preserve">{/unused_B1T}</w:t>
             </w:r>
           </w:p>
         </w:tc>
@@ -725,57 +726,58 @@
             <w:tcW w:w="786" w:type="dxa"/>
           </w:tcPr>
           <w:p>
-            <w:pPr>
-              <w:spacing w:before="120" w:after="120"/>
-              <w:jc w:val="center"/>
-              <w:rPr>
-                <w:rFonts w:ascii="Arial" w:hAnsi="Arial" w:cs="Arial"/>
-                <w:sz w:val="20"/>
-                <w:szCs w:val="20"/>
-              </w:rPr>
-            </w:pPr>
-            <w:r>
-              <w:rPr>
-                <w:rFonts w:ascii="Arial" w:hAnsi="Arial" w:cs="Arial"/>
-                <w:b/>
-                <w:bCs/>
-                <w:sz w:val="20"/>
-                <w:szCs w:val="20"/>
-              </w:rPr>
-              <w:t>B</w:t>
-            </w:r>
-            <w:r>
-              <w:rPr>
-                <w:rFonts w:ascii="Arial" w:hAnsi="Arial" w:cs="Arial"/>
-                <w:b/>
-                <w:bCs/>
-                <w:sz w:val="20"/>
-                <w:szCs w:val="20"/>
-                <w:vertAlign w:val="subscript"/>
-              </w:rPr>
-              <w:t>2</w:t>
-            </w:r>
-            <w:r>
-              <w:rPr>
-                <w:rFonts w:ascii="Arial" w:hAnsi="Arial" w:cs="Arial"/>
-                <w:b/>
-                <w:bCs/>
-                <w:sz w:val="20"/>
-                <w:szCs w:val="20"/>
-              </w:rPr>
-              <w:t>T</w:t>
-            </w:r>
-          </w:p>
-          <w:p>
-            <w:r>
-              <w:rPr>
-                <w:rFonts w:ascii="Arial" w:hAnsi="Arial" w:cs="Arial"/>
-                <w:b/>
-                <w:bCs/>
-                <w:sz w:val="20"/>
-                <w:szCs w:val="20"/>
-              </w:rPr>
-              <w:t xml:space="preserve">{mark_B2T}</w:t>
+            <w:r>
+              <w:rPr>
+                <w:rFonts w:ascii="Arial" w:hAnsi="Arial" w:cs="Arial"/>
+                <w:sz w:val="20"/>
+                <w:szCs w:val="20"/>
+              </w:rPr>
+              <w:t xml:space="preserve">{^unused_B2T}</w:t>
+            </w:r>
+            <w:r>
+              <w:rPr>
+                <w:rFonts w:ascii="Arial" w:hAnsi="Arial" w:cs="Arial"/>
+                <w:b/>
+                <w:bCs/>
+                <w:sz w:val="20"/>
+                <w:szCs w:val="20"/>
+              </w:rPr>
+              <w:t xml:space="preserve">B2T</w:t>
+            </w:r>
+            <w:r>
+              <w:rPr>
+                <w:rFonts w:ascii="Arial" w:hAnsi="Arial" w:cs="Arial"/>
+                <w:sz w:val="20"/>
+                <w:szCs w:val="20"/>
+              </w:rPr>
+              <w:t xml:space="preserve">{/unused_B2T}</w:t>
+            </w:r>
+            <w:r>
+              <w:rPr>
+                <w:rFonts w:ascii="Arial" w:hAnsi="Arial" w:cs="Arial"/>
+                <w:sz w:val="20"/>
+                <w:szCs w:val="20"/>
+              </w:rPr>
+              <w:t xml:space="preserve">{#unused_B2T}</w:t>
+            </w:r>
+            <w:r>
+              <w:rPr>
+                <w:rFonts w:ascii="Arial" w:hAnsi="Arial" w:cs="Arial"/>
+                <w:b/>
+                <w:bCs/>
+                <w:strike/>
+                <w:sz w:val="20"/>
+                <w:szCs w:val="20"/>
+              </w:rPr>
+              <w:t xml:space="preserve">B2T</w:t>
+            </w:r>
+            <w:r>
+              <w:rPr>
+                <w:rFonts w:ascii="Arial" w:hAnsi="Arial" w:cs="Arial"/>
+                <w:sz w:val="20"/>
+                <w:szCs w:val="20"/>
+              </w:rPr>
+              <w:t xml:space="preserve">{/unused_B2T}</w:t>
             </w:r>
           </w:p>
         </w:tc>
@@ -784,61 +786,58 @@
             <w:tcW w:w="786" w:type="dxa"/>
           </w:tcPr>
           <w:p>
-            <w:pPr>
-              <w:spacing w:before="120" w:after="120"/>
-              <w:jc w:val="center"/>
-              <w:rPr>
-                <w:rFonts w:ascii="Arial" w:hAnsi="Arial" w:cs="Arial"/>
-                <w:sz w:val="20"/>
-                <w:szCs w:val="20"/>
-                <w:lang w:val="de-DE"/>
-              </w:rPr>
-            </w:pPr>
-            <w:r>
-              <w:rPr>
-                <w:rFonts w:ascii="Arial" w:hAnsi="Arial" w:cs="Arial"/>
-                <w:b/>
-                <w:bCs/>
-                <w:sz w:val="20"/>
-                <w:szCs w:val="20"/>
-                <w:lang w:val="de-DE"/>
-              </w:rPr>
-              <w:t>H</w:t>
-            </w:r>
-            <w:r>
-              <w:rPr>
-                <w:rFonts w:ascii="Arial" w:hAnsi="Arial" w:cs="Arial"/>
-                <w:b/>
-                <w:bCs/>
-                <w:sz w:val="20"/>
-                <w:szCs w:val="20"/>
-                <w:vertAlign w:val="subscript"/>
-                <w:lang w:val="de-DE"/>
-              </w:rPr>
-              <w:t>1</w:t>
-            </w:r>
-            <w:r>
-              <w:rPr>
-                <w:rFonts w:ascii="Arial" w:hAnsi="Arial" w:cs="Arial"/>
-                <w:b/>
-                <w:bCs/>
-                <w:sz w:val="20"/>
-                <w:szCs w:val="20"/>
-                <w:lang w:val="de-DE"/>
-              </w:rPr>
-              <w:t>T</w:t>
-            </w:r>
-          </w:p>
-          <w:p>
-            <w:r>
-              <w:rPr>
-                <w:rFonts w:ascii="Arial" w:hAnsi="Arial" w:cs="Arial"/>
-                <w:b/>
-                <w:bCs/>
-                <w:sz w:val="20"/>
-                <w:szCs w:val="20"/>
-              </w:rPr>
-              <w:t xml:space="preserve">{mark_H1T}</w:t>
+            <w:r>
+              <w:rPr>
+                <w:rFonts w:ascii="Arial" w:hAnsi="Arial" w:cs="Arial"/>
+                <w:sz w:val="20"/>
+                <w:szCs w:val="20"/>
+              </w:rPr>
+              <w:t xml:space="preserve">{^unused_H1T}</w:t>
+            </w:r>
+            <w:r>
+              <w:rPr>
+                <w:rFonts w:ascii="Arial" w:hAnsi="Arial" w:cs="Arial"/>
+                <w:b/>
+                <w:bCs/>
+                <w:sz w:val="20"/>
+                <w:szCs w:val="20"/>
+              </w:rPr>
+              <w:t xml:space="preserve">H1T</w:t>
+            </w:r>
+            <w:r>
+              <w:rPr>
+                <w:rFonts w:ascii="Arial" w:hAnsi="Arial" w:cs="Arial"/>
+                <w:sz w:val="20"/>
+                <w:szCs w:val="20"/>
+              </w:rPr>
+              <w:t xml:space="preserve">{/unused_H1T}</w:t>
+            </w:r>
+            <w:r>
+              <w:rPr>
+                <w:rFonts w:ascii="Arial" w:hAnsi="Arial" w:cs="Arial"/>
+                <w:sz w:val="20"/>
+                <w:szCs w:val="20"/>
+              </w:rPr>
+              <w:t xml:space="preserve">{#unused_H1T}</w:t>
+            </w:r>
+            <w:r>
+              <w:rPr>
+                <w:rFonts w:ascii="Arial" w:hAnsi="Arial" w:cs="Arial"/>
+                <w:b/>
+                <w:bCs/>
+                <w:strike/>
+                <w:sz w:val="20"/>
+                <w:szCs w:val="20"/>
+              </w:rPr>
+              <w:t xml:space="preserve">H1T</w:t>
+            </w:r>
+            <w:r>
+              <w:rPr>
+                <w:rFonts w:ascii="Arial" w:hAnsi="Arial" w:cs="Arial"/>
+                <w:sz w:val="20"/>
+                <w:szCs w:val="20"/>
+              </w:rPr>
+              <w:t xml:space="preserve">{/unused_H1T}</w:t>
             </w:r>
           </w:p>
         </w:tc>
@@ -847,63 +846,58 @@
             <w:tcW w:w="786" w:type="dxa"/>
           </w:tcPr>
           <w:p>
-            <w:pPr>
-              <w:spacing w:before="120" w:after="120"/>
-              <w:jc w:val="center"/>
-              <w:rPr>
-                <w:rFonts w:ascii="Arial" w:hAnsi="Arial" w:cs="Arial"/>
-                <w:b/>
-                <w:bCs/>
-                <w:sz w:val="20"/>
-                <w:szCs w:val="20"/>
-                <w:lang w:val="de-DE"/>
-              </w:rPr>
-            </w:pPr>
-            <w:r>
-              <w:rPr>
-                <w:rFonts w:ascii="Arial" w:hAnsi="Arial" w:cs="Arial"/>
-                <w:b/>
-                <w:bCs/>
-                <w:sz w:val="20"/>
-                <w:szCs w:val="20"/>
-                <w:lang w:val="de-DE"/>
-              </w:rPr>
-              <w:t>H</w:t>
-            </w:r>
-            <w:r>
-              <w:rPr>
-                <w:rFonts w:ascii="Arial" w:hAnsi="Arial" w:cs="Arial"/>
-                <w:b/>
-                <w:bCs/>
-                <w:sz w:val="20"/>
-                <w:szCs w:val="20"/>
-                <w:vertAlign w:val="subscript"/>
-                <w:lang w:val="de-DE"/>
-              </w:rPr>
-              <w:t>2</w:t>
-            </w:r>
-            <w:r>
-              <w:rPr>
-                <w:rFonts w:ascii="Arial" w:hAnsi="Arial" w:cs="Arial"/>
-                <w:b/>
-                <w:bCs/>
-                <w:sz w:val="20"/>
-                <w:szCs w:val="20"/>
-                <w:lang w:val="de-DE"/>
-              </w:rPr>
-              <w:t>T</w:t>
-            </w:r>
-          </w:p>
-          <w:p>
-            <w:r>
-              <w:rPr>
-                <w:rFonts w:ascii="Arial" w:hAnsi="Arial" w:cs="Arial"/>
-                <w:b/>
-                <w:bCs/>
-                <w:sz w:val="20"/>
-                <w:szCs w:val="20"/>
-              </w:rPr>
-              <w:t xml:space="preserve">{mark_H2T}</w:t>
+            <w:r>
+              <w:rPr>
+                <w:rFonts w:ascii="Arial" w:hAnsi="Arial" w:cs="Arial"/>
+                <w:sz w:val="20"/>
+                <w:szCs w:val="20"/>
+              </w:rPr>
+              <w:t xml:space="preserve">{^unused_H2T}</w:t>
+            </w:r>
+            <w:r>
+              <w:rPr>
+                <w:rFonts w:ascii="Arial" w:hAnsi="Arial" w:cs="Arial"/>
+                <w:b/>
+                <w:bCs/>
+                <w:sz w:val="20"/>
+                <w:szCs w:val="20"/>
+              </w:rPr>
+              <w:t xml:space="preserve">H2T</w:t>
+            </w:r>
+            <w:r>
+              <w:rPr>
+                <w:rFonts w:ascii="Arial" w:hAnsi="Arial" w:cs="Arial"/>
+                <w:sz w:val="20"/>
+                <w:szCs w:val="20"/>
+              </w:rPr>
+              <w:t xml:space="preserve">{/unused_H2T}</w:t>
+            </w:r>
+            <w:r>
+              <w:rPr>
+                <w:rFonts w:ascii="Arial" w:hAnsi="Arial" w:cs="Arial"/>
+                <w:sz w:val="20"/>
+                <w:szCs w:val="20"/>
+              </w:rPr>
+              <w:t xml:space="preserve">{#unused_H2T}</w:t>
+            </w:r>
+            <w:r>
+              <w:rPr>
+                <w:rFonts w:ascii="Arial" w:hAnsi="Arial" w:cs="Arial"/>
+                <w:b/>
+                <w:bCs/>
+                <w:strike/>
+                <w:sz w:val="20"/>
+                <w:szCs w:val="20"/>
+              </w:rPr>
+              <w:t xml:space="preserve">H2T</w:t>
+            </w:r>
+            <w:r>
+              <w:rPr>
+                <w:rFonts w:ascii="Arial" w:hAnsi="Arial" w:cs="Arial"/>
+                <w:sz w:val="20"/>
+                <w:szCs w:val="20"/>
+              </w:rPr>
+              <w:t xml:space="preserve">{/unused_H2T}</w:t>
             </w:r>
           </w:p>
         </w:tc>
@@ -912,61 +906,58 @@
             <w:tcW w:w="786" w:type="dxa"/>
           </w:tcPr>
           <w:p>
-            <w:pPr>
-              <w:spacing w:before="120" w:after="120"/>
-              <w:jc w:val="center"/>
-              <w:rPr>
-                <w:rFonts w:ascii="Arial" w:hAnsi="Arial" w:cs="Arial"/>
-                <w:sz w:val="20"/>
-                <w:szCs w:val="20"/>
-                <w:lang w:val="de-DE"/>
-              </w:rPr>
-            </w:pPr>
-            <w:r>
-              <w:rPr>
-                <w:rFonts w:ascii="Arial" w:hAnsi="Arial" w:cs="Arial"/>
-                <w:b/>
-                <w:bCs/>
-                <w:sz w:val="20"/>
-                <w:szCs w:val="20"/>
-                <w:lang w:val="de-DE"/>
-              </w:rPr>
-              <w:t>B</w:t>
-            </w:r>
-            <w:r>
-              <w:rPr>
-                <w:rFonts w:ascii="Arial" w:hAnsi="Arial" w:cs="Arial"/>
-                <w:b/>
-                <w:bCs/>
-                <w:sz w:val="20"/>
-                <w:szCs w:val="20"/>
-                <w:vertAlign w:val="subscript"/>
-                <w:lang w:val="de-DE"/>
-              </w:rPr>
-              <w:t>1</w:t>
-            </w:r>
-            <w:r>
-              <w:rPr>
-                <w:rFonts w:ascii="Arial" w:hAnsi="Arial" w:cs="Arial"/>
-                <w:b/>
-                <w:bCs/>
-                <w:sz w:val="20"/>
-                <w:szCs w:val="20"/>
-                <w:lang w:val="de-DE"/>
-              </w:rPr>
-              <w:t>N</w:t>
-            </w:r>
-          </w:p>
-          <w:p>
-            <w:r>
-              <w:rPr>
-                <w:rFonts w:ascii="Arial" w:hAnsi="Arial" w:cs="Arial"/>
-                <w:b/>
-                <w:bCs/>
-                <w:sz w:val="20"/>
-                <w:szCs w:val="20"/>
-              </w:rPr>
-              <w:t xml:space="preserve">{mark_B1N}</w:t>
+            <w:r>
+              <w:rPr>
+                <w:rFonts w:ascii="Arial" w:hAnsi="Arial" w:cs="Arial"/>
+                <w:sz w:val="20"/>
+                <w:szCs w:val="20"/>
+              </w:rPr>
+              <w:t xml:space="preserve">{^unused_B1N}</w:t>
+            </w:r>
+            <w:r>
+              <w:rPr>
+                <w:rFonts w:ascii="Arial" w:hAnsi="Arial" w:cs="Arial"/>
+                <w:b/>
+                <w:bCs/>
+                <w:sz w:val="20"/>
+                <w:szCs w:val="20"/>
+              </w:rPr>
+              <w:t xml:space="preserve">B1N</w:t>
+            </w:r>
+            <w:r>
+              <w:rPr>
+                <w:rFonts w:ascii="Arial" w:hAnsi="Arial" w:cs="Arial"/>
+                <w:sz w:val="20"/>
+                <w:szCs w:val="20"/>
+              </w:rPr>
+              <w:t xml:space="preserve">{/unused_B1N}</w:t>
+            </w:r>
+            <w:r>
+              <w:rPr>
+                <w:rFonts w:ascii="Arial" w:hAnsi="Arial" w:cs="Arial"/>
+                <w:sz w:val="20"/>
+                <w:szCs w:val="20"/>
+              </w:rPr>
+              <w:t xml:space="preserve">{#unused_B1N}</w:t>
+            </w:r>
+            <w:r>
+              <w:rPr>
+                <w:rFonts w:ascii="Arial" w:hAnsi="Arial" w:cs="Arial"/>
+                <w:b/>
+                <w:bCs/>
+                <w:strike/>
+                <w:sz w:val="20"/>
+                <w:szCs w:val="20"/>
+              </w:rPr>
+              <w:t xml:space="preserve">B1N</w:t>
+            </w:r>
+            <w:r>
+              <w:rPr>
+                <w:rFonts w:ascii="Arial" w:hAnsi="Arial" w:cs="Arial"/>
+                <w:sz w:val="20"/>
+                <w:szCs w:val="20"/>
+              </w:rPr>
+              <w:t xml:space="preserve">{/unused_B1N}</w:t>
             </w:r>
           </w:p>
         </w:tc>
@@ -975,57 +966,58 @@
             <w:tcW w:w="786" w:type="dxa"/>
           </w:tcPr>
           <w:p>
-            <w:pPr>
-              <w:spacing w:before="120" w:after="120"/>
-              <w:jc w:val="center"/>
-              <w:rPr>
-                <w:rFonts w:ascii="Arial" w:hAnsi="Arial" w:cs="Arial"/>
-                <w:sz w:val="20"/>
-                <w:szCs w:val="20"/>
-              </w:rPr>
-            </w:pPr>
-            <w:r>
-              <w:rPr>
-                <w:rFonts w:ascii="Arial" w:hAnsi="Arial" w:cs="Arial"/>
-                <w:b/>
-                <w:bCs/>
-                <w:sz w:val="20"/>
-                <w:szCs w:val="20"/>
-              </w:rPr>
-              <w:t>B</w:t>
-            </w:r>
-            <w:r>
-              <w:rPr>
-                <w:rFonts w:ascii="Arial" w:hAnsi="Arial" w:cs="Arial"/>
-                <w:b/>
-                <w:bCs/>
-                <w:sz w:val="20"/>
-                <w:szCs w:val="20"/>
-                <w:vertAlign w:val="subscript"/>
-              </w:rPr>
-              <w:t>2</w:t>
-            </w:r>
-            <w:r>
-              <w:rPr>
-                <w:rFonts w:ascii="Arial" w:hAnsi="Arial" w:cs="Arial"/>
-                <w:b/>
-                <w:bCs/>
-                <w:sz w:val="20"/>
-                <w:szCs w:val="20"/>
-              </w:rPr>
-              <w:t>N</w:t>
-            </w:r>
-          </w:p>
-          <w:p>
-            <w:r>
-              <w:rPr>
-                <w:rFonts w:ascii="Arial" w:hAnsi="Arial" w:cs="Arial"/>
-                <w:b/>
-                <w:bCs/>
-                <w:sz w:val="20"/>
-                <w:szCs w:val="20"/>
-              </w:rPr>
-              <w:t xml:space="preserve">{mark_B2N}</w:t>
+            <w:r>
+              <w:rPr>
+                <w:rFonts w:ascii="Arial" w:hAnsi="Arial" w:cs="Arial"/>
+                <w:sz w:val="20"/>
+                <w:szCs w:val="20"/>
+              </w:rPr>
+              <w:t xml:space="preserve">{^unused_B2N}</w:t>
+            </w:r>
+            <w:r>
+              <w:rPr>
+                <w:rFonts w:ascii="Arial" w:hAnsi="Arial" w:cs="Arial"/>
+                <w:b/>
+                <w:bCs/>
+                <w:sz w:val="20"/>
+                <w:szCs w:val="20"/>
+              </w:rPr>
+              <w:t xml:space="preserve">B2N</w:t>
+            </w:r>
+            <w:r>
+              <w:rPr>
+                <w:rFonts w:ascii="Arial" w:hAnsi="Arial" w:cs="Arial"/>
+                <w:sz w:val="20"/>
+                <w:szCs w:val="20"/>
+              </w:rPr>
+              <w:t xml:space="preserve">{/unused_B2N}</w:t>
+            </w:r>
+            <w:r>
+              <w:rPr>
+                <w:rFonts w:ascii="Arial" w:hAnsi="Arial" w:cs="Arial"/>
+                <w:sz w:val="20"/>
+                <w:szCs w:val="20"/>
+              </w:rPr>
+              <w:t xml:space="preserve">{#unused_B2N}</w:t>
+            </w:r>
+            <w:r>
+              <w:rPr>
+                <w:rFonts w:ascii="Arial" w:hAnsi="Arial" w:cs="Arial"/>
+                <w:b/>
+                <w:bCs/>
+                <w:strike/>
+                <w:sz w:val="20"/>
+                <w:szCs w:val="20"/>
+              </w:rPr>
+              <w:t xml:space="preserve">B2N</w:t>
+            </w:r>
+            <w:r>
+              <w:rPr>
+                <w:rFonts w:ascii="Arial" w:hAnsi="Arial" w:cs="Arial"/>
+                <w:sz w:val="20"/>
+                <w:szCs w:val="20"/>
+              </w:rPr>
+              <w:t xml:space="preserve">{/unused_B2N}</w:t>
             </w:r>
           </w:p>
         </w:tc>
@@ -1034,57 +1026,58 @@
             <w:tcW w:w="786" w:type="dxa"/>
           </w:tcPr>
           <w:p>
-            <w:pPr>
-              <w:spacing w:before="120" w:after="120"/>
-              <w:jc w:val="center"/>
-              <w:rPr>
-                <w:rFonts w:ascii="Arial" w:hAnsi="Arial" w:cs="Arial"/>
-                <w:sz w:val="20"/>
-                <w:szCs w:val="20"/>
-              </w:rPr>
-            </w:pPr>
-            <w:r>
-              <w:rPr>
-                <w:rFonts w:ascii="Arial" w:hAnsi="Arial" w:cs="Arial"/>
-                <w:b/>
-                <w:bCs/>
-                <w:sz w:val="20"/>
-                <w:szCs w:val="20"/>
-              </w:rPr>
-              <w:t>H</w:t>
-            </w:r>
-            <w:r>
-              <w:rPr>
-                <w:rFonts w:ascii="Arial" w:hAnsi="Arial" w:cs="Arial"/>
-                <w:b/>
-                <w:bCs/>
-                <w:sz w:val="20"/>
-                <w:szCs w:val="20"/>
-                <w:vertAlign w:val="subscript"/>
-              </w:rPr>
-              <w:t>1</w:t>
-            </w:r>
-            <w:r>
-              <w:rPr>
-                <w:rFonts w:ascii="Arial" w:hAnsi="Arial" w:cs="Arial"/>
-                <w:b/>
-                <w:bCs/>
-                <w:sz w:val="20"/>
-                <w:szCs w:val="20"/>
-              </w:rPr>
-              <w:t>N</w:t>
-            </w:r>
-          </w:p>
-          <w:p>
-            <w:r>
-              <w:rPr>
-                <w:rFonts w:ascii="Arial" w:hAnsi="Arial" w:cs="Arial"/>
-                <w:b/>
-                <w:bCs/>
-                <w:sz w:val="20"/>
-                <w:szCs w:val="20"/>
-              </w:rPr>
-              <w:t xml:space="preserve">{mark_H1N}</w:t>
+            <w:r>
+              <w:rPr>
+                <w:rFonts w:ascii="Arial" w:hAnsi="Arial" w:cs="Arial"/>
+                <w:sz w:val="20"/>
+                <w:szCs w:val="20"/>
+              </w:rPr>
+              <w:t xml:space="preserve">{^unused_H1N}</w:t>
+            </w:r>
+            <w:r>
+              <w:rPr>
+                <w:rFonts w:ascii="Arial" w:hAnsi="Arial" w:cs="Arial"/>
+                <w:b/>
+                <w:bCs/>
+                <w:sz w:val="20"/>
+                <w:szCs w:val="20"/>
+              </w:rPr>
+              <w:t xml:space="preserve">H1N</w:t>
+            </w:r>
+            <w:r>
+              <w:rPr>
+                <w:rFonts w:ascii="Arial" w:hAnsi="Arial" w:cs="Arial"/>
+                <w:sz w:val="20"/>
+                <w:szCs w:val="20"/>
+              </w:rPr>
+              <w:t xml:space="preserve">{/unused_H1N}</w:t>
+            </w:r>
+            <w:r>
+              <w:rPr>
+                <w:rFonts w:ascii="Arial" w:hAnsi="Arial" w:cs="Arial"/>
+                <w:sz w:val="20"/>
+                <w:szCs w:val="20"/>
+              </w:rPr>
+              <w:t xml:space="preserve">{#unused_H1N}</w:t>
+            </w:r>
+            <w:r>
+              <w:rPr>
+                <w:rFonts w:ascii="Arial" w:hAnsi="Arial" w:cs="Arial"/>
+                <w:b/>
+                <w:bCs/>
+                <w:strike/>
+                <w:sz w:val="20"/>
+                <w:szCs w:val="20"/>
+              </w:rPr>
+              <w:t xml:space="preserve">H1N</w:t>
+            </w:r>
+            <w:r>
+              <w:rPr>
+                <w:rFonts w:ascii="Arial" w:hAnsi="Arial" w:cs="Arial"/>
+                <w:sz w:val="20"/>
+                <w:szCs w:val="20"/>
+              </w:rPr>
+              <w:t xml:space="preserve">{/unused_H1N}</w:t>
             </w:r>
           </w:p>
         </w:tc>
@@ -1093,57 +1086,58 @@
             <w:tcW w:w="521" w:type="dxa"/>
           </w:tcPr>
           <w:p>
-            <w:pPr>
-              <w:spacing w:before="120" w:after="120"/>
-              <w:jc w:val="center"/>
-              <w:rPr>
-                <w:rFonts w:ascii="Arial" w:hAnsi="Arial" w:cs="Arial"/>
-                <w:sz w:val="20"/>
-                <w:szCs w:val="20"/>
-              </w:rPr>
-            </w:pPr>
-            <w:r>
-              <w:rPr>
-                <w:rFonts w:ascii="Arial" w:hAnsi="Arial" w:cs="Arial"/>
-                <w:b/>
-                <w:bCs/>
-                <w:sz w:val="20"/>
-                <w:szCs w:val="20"/>
-              </w:rPr>
-              <w:t>H</w:t>
-            </w:r>
-            <w:r>
-              <w:rPr>
-                <w:rFonts w:ascii="Arial" w:hAnsi="Arial" w:cs="Arial"/>
-                <w:b/>
-                <w:bCs/>
-                <w:sz w:val="20"/>
-                <w:szCs w:val="20"/>
-                <w:vertAlign w:val="subscript"/>
-              </w:rPr>
-              <w:t>2</w:t>
-            </w:r>
-            <w:r>
-              <w:rPr>
-                <w:rFonts w:ascii="Arial" w:hAnsi="Arial" w:cs="Arial"/>
-                <w:b/>
-                <w:bCs/>
-                <w:sz w:val="20"/>
-                <w:szCs w:val="20"/>
-              </w:rPr>
-              <w:t>N</w:t>
-            </w:r>
-          </w:p>
-          <w:p>
-            <w:r>
-              <w:rPr>
-                <w:rFonts w:ascii="Arial" w:hAnsi="Arial" w:cs="Arial"/>
-                <w:b/>
-                <w:bCs/>
-                <w:sz w:val="20"/>
-                <w:szCs w:val="20"/>
-              </w:rPr>
-              <w:t xml:space="preserve">{mark_H2N}</w:t>
+            <w:r>
+              <w:rPr>
+                <w:rFonts w:ascii="Arial" w:hAnsi="Arial" w:cs="Arial"/>
+                <w:sz w:val="20"/>
+                <w:szCs w:val="20"/>
+              </w:rPr>
+              <w:t xml:space="preserve">{^unused_H2N}</w:t>
+            </w:r>
+            <w:r>
+              <w:rPr>
+                <w:rFonts w:ascii="Arial" w:hAnsi="Arial" w:cs="Arial"/>
+                <w:b/>
+                <w:bCs/>
+                <w:sz w:val="20"/>
+                <w:szCs w:val="20"/>
+              </w:rPr>
+              <w:t xml:space="preserve">H2N</w:t>
+            </w:r>
+            <w:r>
+              <w:rPr>
+                <w:rFonts w:ascii="Arial" w:hAnsi="Arial" w:cs="Arial"/>
+                <w:sz w:val="20"/>
+                <w:szCs w:val="20"/>
+              </w:rPr>
+              <w:t xml:space="preserve">{/unused_H2N}</w:t>
+            </w:r>
+            <w:r>
+              <w:rPr>
+                <w:rFonts w:ascii="Arial" w:hAnsi="Arial" w:cs="Arial"/>
+                <w:sz w:val="20"/>
+                <w:szCs w:val="20"/>
+              </w:rPr>
+              <w:t xml:space="preserve">{#unused_H2N}</w:t>
+            </w:r>
+            <w:r>
+              <w:rPr>
+                <w:rFonts w:ascii="Arial" w:hAnsi="Arial" w:cs="Arial"/>
+                <w:b/>
+                <w:bCs/>
+                <w:strike/>
+                <w:sz w:val="20"/>
+                <w:szCs w:val="20"/>
+              </w:rPr>
+              <w:t xml:space="preserve">H2N</w:t>
+            </w:r>
+            <w:r>
+              <w:rPr>
+                <w:rFonts w:ascii="Arial" w:hAnsi="Arial" w:cs="Arial"/>
+                <w:sz w:val="20"/>
+                <w:szCs w:val="20"/>
+              </w:rPr>
+              <w:t xml:space="preserve">{/unused_H2N}</w:t>
             </w:r>
           </w:p>
         </w:tc>

</xml_diff>

<commit_message>
Use a big bold X mark instead of a strike-through for unused symbols
Back to an explicit X (28pt, bold) under each unused symbol in the
legend, rather than a line through the code - clearer and more visible
than the strike-through, per feedback. The requested symbol(s) stay
blank underneath.

- ST (real template): {mark_<SYMBOL>} tag under each of the 8 legend
  codes, "X" or empty depending on whether it was requested.
- HT: same treatment on its 16-symbol legend via the docx library.

Co-Authored-By: Claude Sonnet 5 <noreply@anthropic.com>
Claude-Session: https://claude.ai/code/session_01Vv9yTc5WTYyhneR3pGmzMX
</commit_message>
<xml_diff>
--- a/server/templates/annexe_ST.docx
+++ b/server/templates/annexe_ST.docx
@@ -666,58 +666,57 @@
             <w:tcW w:w="786" w:type="dxa"/>
           </w:tcPr>
           <w:p>
-            <w:r>
-              <w:rPr>
-                <w:rFonts w:ascii="Arial" w:hAnsi="Arial" w:cs="Arial"/>
-                <w:sz w:val="20"/>
-                <w:szCs w:val="20"/>
-              </w:rPr>
-              <w:t xml:space="preserve">{^unused_B1T}</w:t>
-            </w:r>
-            <w:r>
-              <w:rPr>
-                <w:rFonts w:ascii="Arial" w:hAnsi="Arial" w:cs="Arial"/>
-                <w:b/>
-                <w:bCs/>
-                <w:sz w:val="20"/>
-                <w:szCs w:val="20"/>
-              </w:rPr>
-              <w:t xml:space="preserve">B1T</w:t>
-            </w:r>
-            <w:r>
-              <w:rPr>
-                <w:rFonts w:ascii="Arial" w:hAnsi="Arial" w:cs="Arial"/>
-                <w:sz w:val="20"/>
-                <w:szCs w:val="20"/>
-              </w:rPr>
-              <w:t xml:space="preserve">{/unused_B1T}</w:t>
-            </w:r>
-            <w:r>
-              <w:rPr>
-                <w:rFonts w:ascii="Arial" w:hAnsi="Arial" w:cs="Arial"/>
-                <w:sz w:val="20"/>
-                <w:szCs w:val="20"/>
-              </w:rPr>
-              <w:t xml:space="preserve">{#unused_B1T}</w:t>
-            </w:r>
-            <w:r>
-              <w:rPr>
-                <w:rFonts w:ascii="Arial" w:hAnsi="Arial" w:cs="Arial"/>
-                <w:b/>
-                <w:bCs/>
-                <w:strike/>
-                <w:sz w:val="20"/>
-                <w:szCs w:val="20"/>
-              </w:rPr>
-              <w:t xml:space="preserve">B1T</w:t>
-            </w:r>
-            <w:r>
-              <w:rPr>
-                <w:rFonts w:ascii="Arial" w:hAnsi="Arial" w:cs="Arial"/>
-                <w:sz w:val="20"/>
-                <w:szCs w:val="20"/>
-              </w:rPr>
-              <w:t xml:space="preserve">{/unused_B1T}</w:t>
+            <w:pPr>
+              <w:spacing w:before="120" w:after="120"/>
+              <w:jc w:val="center"/>
+              <w:rPr>
+                <w:rFonts w:ascii="Arial" w:hAnsi="Arial" w:cs="Arial"/>
+                <w:sz w:val="20"/>
+                <w:szCs w:val="20"/>
+              </w:rPr>
+            </w:pPr>
+            <w:r>
+              <w:rPr>
+                <w:rFonts w:ascii="Arial" w:hAnsi="Arial" w:cs="Arial"/>
+                <w:b/>
+                <w:bCs/>
+                <w:sz w:val="20"/>
+                <w:szCs w:val="20"/>
+              </w:rPr>
+              <w:t>B</w:t>
+            </w:r>
+            <w:r>
+              <w:rPr>
+                <w:rFonts w:ascii="Arial" w:hAnsi="Arial" w:cs="Arial"/>
+                <w:b/>
+                <w:bCs/>
+                <w:sz w:val="20"/>
+                <w:szCs w:val="20"/>
+                <w:vertAlign w:val="subscript"/>
+              </w:rPr>
+              <w:t>1</w:t>
+            </w:r>
+            <w:r>
+              <w:rPr>
+                <w:rFonts w:ascii="Arial" w:hAnsi="Arial" w:cs="Arial"/>
+                <w:b/>
+                <w:bCs/>
+                <w:sz w:val="20"/>
+                <w:szCs w:val="20"/>
+              </w:rPr>
+              <w:t>T</w:t>
+            </w:r>
+          </w:p>
+          <w:p>
+            <w:r>
+              <w:rPr>
+                <w:rFonts w:ascii="Arial" w:hAnsi="Arial" w:cs="Arial"/>
+                <w:b/>
+                <w:bCs/>
+                <w:sz w:val="56"/>
+                <w:szCs w:val="56"/>
+              </w:rPr>
+              <w:t xml:space="preserve">{mark_B1T}</w:t>
             </w:r>
           </w:p>
         </w:tc>
@@ -726,58 +725,57 @@
             <w:tcW w:w="786" w:type="dxa"/>
           </w:tcPr>
           <w:p>
-            <w:r>
-              <w:rPr>
-                <w:rFonts w:ascii="Arial" w:hAnsi="Arial" w:cs="Arial"/>
-                <w:sz w:val="20"/>
-                <w:szCs w:val="20"/>
-              </w:rPr>
-              <w:t xml:space="preserve">{^unused_B2T}</w:t>
-            </w:r>
-            <w:r>
-              <w:rPr>
-                <w:rFonts w:ascii="Arial" w:hAnsi="Arial" w:cs="Arial"/>
-                <w:b/>
-                <w:bCs/>
-                <w:sz w:val="20"/>
-                <w:szCs w:val="20"/>
-              </w:rPr>
-              <w:t xml:space="preserve">B2T</w:t>
-            </w:r>
-            <w:r>
-              <w:rPr>
-                <w:rFonts w:ascii="Arial" w:hAnsi="Arial" w:cs="Arial"/>
-                <w:sz w:val="20"/>
-                <w:szCs w:val="20"/>
-              </w:rPr>
-              <w:t xml:space="preserve">{/unused_B2T}</w:t>
-            </w:r>
-            <w:r>
-              <w:rPr>
-                <w:rFonts w:ascii="Arial" w:hAnsi="Arial" w:cs="Arial"/>
-                <w:sz w:val="20"/>
-                <w:szCs w:val="20"/>
-              </w:rPr>
-              <w:t xml:space="preserve">{#unused_B2T}</w:t>
-            </w:r>
-            <w:r>
-              <w:rPr>
-                <w:rFonts w:ascii="Arial" w:hAnsi="Arial" w:cs="Arial"/>
-                <w:b/>
-                <w:bCs/>
-                <w:strike/>
-                <w:sz w:val="20"/>
-                <w:szCs w:val="20"/>
-              </w:rPr>
-              <w:t xml:space="preserve">B2T</w:t>
-            </w:r>
-            <w:r>
-              <w:rPr>
-                <w:rFonts w:ascii="Arial" w:hAnsi="Arial" w:cs="Arial"/>
-                <w:sz w:val="20"/>
-                <w:szCs w:val="20"/>
-              </w:rPr>
-              <w:t xml:space="preserve">{/unused_B2T}</w:t>
+            <w:pPr>
+              <w:spacing w:before="120" w:after="120"/>
+              <w:jc w:val="center"/>
+              <w:rPr>
+                <w:rFonts w:ascii="Arial" w:hAnsi="Arial" w:cs="Arial"/>
+                <w:sz w:val="20"/>
+                <w:szCs w:val="20"/>
+              </w:rPr>
+            </w:pPr>
+            <w:r>
+              <w:rPr>
+                <w:rFonts w:ascii="Arial" w:hAnsi="Arial" w:cs="Arial"/>
+                <w:b/>
+                <w:bCs/>
+                <w:sz w:val="20"/>
+                <w:szCs w:val="20"/>
+              </w:rPr>
+              <w:t>B</w:t>
+            </w:r>
+            <w:r>
+              <w:rPr>
+                <w:rFonts w:ascii="Arial" w:hAnsi="Arial" w:cs="Arial"/>
+                <w:b/>
+                <w:bCs/>
+                <w:sz w:val="20"/>
+                <w:szCs w:val="20"/>
+                <w:vertAlign w:val="subscript"/>
+              </w:rPr>
+              <w:t>2</w:t>
+            </w:r>
+            <w:r>
+              <w:rPr>
+                <w:rFonts w:ascii="Arial" w:hAnsi="Arial" w:cs="Arial"/>
+                <w:b/>
+                <w:bCs/>
+                <w:sz w:val="20"/>
+                <w:szCs w:val="20"/>
+              </w:rPr>
+              <w:t>T</w:t>
+            </w:r>
+          </w:p>
+          <w:p>
+            <w:r>
+              <w:rPr>
+                <w:rFonts w:ascii="Arial" w:hAnsi="Arial" w:cs="Arial"/>
+                <w:b/>
+                <w:bCs/>
+                <w:sz w:val="56"/>
+                <w:szCs w:val="56"/>
+              </w:rPr>
+              <w:t xml:space="preserve">{mark_B2T}</w:t>
             </w:r>
           </w:p>
         </w:tc>
@@ -786,58 +784,61 @@
             <w:tcW w:w="786" w:type="dxa"/>
           </w:tcPr>
           <w:p>
-            <w:r>
-              <w:rPr>
-                <w:rFonts w:ascii="Arial" w:hAnsi="Arial" w:cs="Arial"/>
-                <w:sz w:val="20"/>
-                <w:szCs w:val="20"/>
-              </w:rPr>
-              <w:t xml:space="preserve">{^unused_H1T}</w:t>
-            </w:r>
-            <w:r>
-              <w:rPr>
-                <w:rFonts w:ascii="Arial" w:hAnsi="Arial" w:cs="Arial"/>
-                <w:b/>
-                <w:bCs/>
-                <w:sz w:val="20"/>
-                <w:szCs w:val="20"/>
-              </w:rPr>
-              <w:t xml:space="preserve">H1T</w:t>
-            </w:r>
-            <w:r>
-              <w:rPr>
-                <w:rFonts w:ascii="Arial" w:hAnsi="Arial" w:cs="Arial"/>
-                <w:sz w:val="20"/>
-                <w:szCs w:val="20"/>
-              </w:rPr>
-              <w:t xml:space="preserve">{/unused_H1T}</w:t>
-            </w:r>
-            <w:r>
-              <w:rPr>
-                <w:rFonts w:ascii="Arial" w:hAnsi="Arial" w:cs="Arial"/>
-                <w:sz w:val="20"/>
-                <w:szCs w:val="20"/>
-              </w:rPr>
-              <w:t xml:space="preserve">{#unused_H1T}</w:t>
-            </w:r>
-            <w:r>
-              <w:rPr>
-                <w:rFonts w:ascii="Arial" w:hAnsi="Arial" w:cs="Arial"/>
-                <w:b/>
-                <w:bCs/>
-                <w:strike/>
-                <w:sz w:val="20"/>
-                <w:szCs w:val="20"/>
-              </w:rPr>
-              <w:t xml:space="preserve">H1T</w:t>
-            </w:r>
-            <w:r>
-              <w:rPr>
-                <w:rFonts w:ascii="Arial" w:hAnsi="Arial" w:cs="Arial"/>
-                <w:sz w:val="20"/>
-                <w:szCs w:val="20"/>
-              </w:rPr>
-              <w:t xml:space="preserve">{/unused_H1T}</w:t>
+            <w:pPr>
+              <w:spacing w:before="120" w:after="120"/>
+              <w:jc w:val="center"/>
+              <w:rPr>
+                <w:rFonts w:ascii="Arial" w:hAnsi="Arial" w:cs="Arial"/>
+                <w:sz w:val="20"/>
+                <w:szCs w:val="20"/>
+                <w:lang w:val="de-DE"/>
+              </w:rPr>
+            </w:pPr>
+            <w:r>
+              <w:rPr>
+                <w:rFonts w:ascii="Arial" w:hAnsi="Arial" w:cs="Arial"/>
+                <w:b/>
+                <w:bCs/>
+                <w:sz w:val="20"/>
+                <w:szCs w:val="20"/>
+                <w:lang w:val="de-DE"/>
+              </w:rPr>
+              <w:t>H</w:t>
+            </w:r>
+            <w:r>
+              <w:rPr>
+                <w:rFonts w:ascii="Arial" w:hAnsi="Arial" w:cs="Arial"/>
+                <w:b/>
+                <w:bCs/>
+                <w:sz w:val="20"/>
+                <w:szCs w:val="20"/>
+                <w:vertAlign w:val="subscript"/>
+                <w:lang w:val="de-DE"/>
+              </w:rPr>
+              <w:t>1</w:t>
+            </w:r>
+            <w:r>
+              <w:rPr>
+                <w:rFonts w:ascii="Arial" w:hAnsi="Arial" w:cs="Arial"/>
+                <w:b/>
+                <w:bCs/>
+                <w:sz w:val="20"/>
+                <w:szCs w:val="20"/>
+                <w:lang w:val="de-DE"/>
+              </w:rPr>
+              <w:t>T</w:t>
+            </w:r>
+          </w:p>
+          <w:p>
+            <w:r>
+              <w:rPr>
+                <w:rFonts w:ascii="Arial" w:hAnsi="Arial" w:cs="Arial"/>
+                <w:b/>
+                <w:bCs/>
+                <w:sz w:val="56"/>
+                <w:szCs w:val="56"/>
+              </w:rPr>
+              <w:t xml:space="preserve">{mark_H1T}</w:t>
             </w:r>
           </w:p>
         </w:tc>
@@ -846,58 +847,63 @@
             <w:tcW w:w="786" w:type="dxa"/>
           </w:tcPr>
           <w:p>
-            <w:r>
-              <w:rPr>
-                <w:rFonts w:ascii="Arial" w:hAnsi="Arial" w:cs="Arial"/>
-                <w:sz w:val="20"/>
-                <w:szCs w:val="20"/>
-              </w:rPr>
-              <w:t xml:space="preserve">{^unused_H2T}</w:t>
-            </w:r>
-            <w:r>
-              <w:rPr>
-                <w:rFonts w:ascii="Arial" w:hAnsi="Arial" w:cs="Arial"/>
-                <w:b/>
-                <w:bCs/>
-                <w:sz w:val="20"/>
-                <w:szCs w:val="20"/>
-              </w:rPr>
-              <w:t xml:space="preserve">H2T</w:t>
-            </w:r>
-            <w:r>
-              <w:rPr>
-                <w:rFonts w:ascii="Arial" w:hAnsi="Arial" w:cs="Arial"/>
-                <w:sz w:val="20"/>
-                <w:szCs w:val="20"/>
-              </w:rPr>
-              <w:t xml:space="preserve">{/unused_H2T}</w:t>
-            </w:r>
-            <w:r>
-              <w:rPr>
-                <w:rFonts w:ascii="Arial" w:hAnsi="Arial" w:cs="Arial"/>
-                <w:sz w:val="20"/>
-                <w:szCs w:val="20"/>
-              </w:rPr>
-              <w:t xml:space="preserve">{#unused_H2T}</w:t>
-            </w:r>
-            <w:r>
-              <w:rPr>
-                <w:rFonts w:ascii="Arial" w:hAnsi="Arial" w:cs="Arial"/>
-                <w:b/>
-                <w:bCs/>
-                <w:strike/>
-                <w:sz w:val="20"/>
-                <w:szCs w:val="20"/>
-              </w:rPr>
-              <w:t xml:space="preserve">H2T</w:t>
-            </w:r>
-            <w:r>
-              <w:rPr>
-                <w:rFonts w:ascii="Arial" w:hAnsi="Arial" w:cs="Arial"/>
-                <w:sz w:val="20"/>
-                <w:szCs w:val="20"/>
-              </w:rPr>
-              <w:t xml:space="preserve">{/unused_H2T}</w:t>
+            <w:pPr>
+              <w:spacing w:before="120" w:after="120"/>
+              <w:jc w:val="center"/>
+              <w:rPr>
+                <w:rFonts w:ascii="Arial" w:hAnsi="Arial" w:cs="Arial"/>
+                <w:b/>
+                <w:bCs/>
+                <w:sz w:val="20"/>
+                <w:szCs w:val="20"/>
+                <w:lang w:val="de-DE"/>
+              </w:rPr>
+            </w:pPr>
+            <w:r>
+              <w:rPr>
+                <w:rFonts w:ascii="Arial" w:hAnsi="Arial" w:cs="Arial"/>
+                <w:b/>
+                <w:bCs/>
+                <w:sz w:val="20"/>
+                <w:szCs w:val="20"/>
+                <w:lang w:val="de-DE"/>
+              </w:rPr>
+              <w:t>H</w:t>
+            </w:r>
+            <w:r>
+              <w:rPr>
+                <w:rFonts w:ascii="Arial" w:hAnsi="Arial" w:cs="Arial"/>
+                <w:b/>
+                <w:bCs/>
+                <w:sz w:val="20"/>
+                <w:szCs w:val="20"/>
+                <w:vertAlign w:val="subscript"/>
+                <w:lang w:val="de-DE"/>
+              </w:rPr>
+              <w:t>2</w:t>
+            </w:r>
+            <w:r>
+              <w:rPr>
+                <w:rFonts w:ascii="Arial" w:hAnsi="Arial" w:cs="Arial"/>
+                <w:b/>
+                <w:bCs/>
+                <w:sz w:val="20"/>
+                <w:szCs w:val="20"/>
+                <w:lang w:val="de-DE"/>
+              </w:rPr>
+              <w:t>T</w:t>
+            </w:r>
+          </w:p>
+          <w:p>
+            <w:r>
+              <w:rPr>
+                <w:rFonts w:ascii="Arial" w:hAnsi="Arial" w:cs="Arial"/>
+                <w:b/>
+                <w:bCs/>
+                <w:sz w:val="56"/>
+                <w:szCs w:val="56"/>
+              </w:rPr>
+              <w:t xml:space="preserve">{mark_H2T}</w:t>
             </w:r>
           </w:p>
         </w:tc>
@@ -906,58 +912,61 @@
             <w:tcW w:w="786" w:type="dxa"/>
           </w:tcPr>
           <w:p>
-            <w:r>
-              <w:rPr>
-                <w:rFonts w:ascii="Arial" w:hAnsi="Arial" w:cs="Arial"/>
-                <w:sz w:val="20"/>
-                <w:szCs w:val="20"/>
-              </w:rPr>
-              <w:t xml:space="preserve">{^unused_B1N}</w:t>
-            </w:r>
-            <w:r>
-              <w:rPr>
-                <w:rFonts w:ascii="Arial" w:hAnsi="Arial" w:cs="Arial"/>
-                <w:b/>
-                <w:bCs/>
-                <w:sz w:val="20"/>
-                <w:szCs w:val="20"/>
-              </w:rPr>
-              <w:t xml:space="preserve">B1N</w:t>
-            </w:r>
-            <w:r>
-              <w:rPr>
-                <w:rFonts w:ascii="Arial" w:hAnsi="Arial" w:cs="Arial"/>
-                <w:sz w:val="20"/>
-                <w:szCs w:val="20"/>
-              </w:rPr>
-              <w:t xml:space="preserve">{/unused_B1N}</w:t>
-            </w:r>
-            <w:r>
-              <w:rPr>
-                <w:rFonts w:ascii="Arial" w:hAnsi="Arial" w:cs="Arial"/>
-                <w:sz w:val="20"/>
-                <w:szCs w:val="20"/>
-              </w:rPr>
-              <w:t xml:space="preserve">{#unused_B1N}</w:t>
-            </w:r>
-            <w:r>
-              <w:rPr>
-                <w:rFonts w:ascii="Arial" w:hAnsi="Arial" w:cs="Arial"/>
-                <w:b/>
-                <w:bCs/>
-                <w:strike/>
-                <w:sz w:val="20"/>
-                <w:szCs w:val="20"/>
-              </w:rPr>
-              <w:t xml:space="preserve">B1N</w:t>
-            </w:r>
-            <w:r>
-              <w:rPr>
-                <w:rFonts w:ascii="Arial" w:hAnsi="Arial" w:cs="Arial"/>
-                <w:sz w:val="20"/>
-                <w:szCs w:val="20"/>
-              </w:rPr>
-              <w:t xml:space="preserve">{/unused_B1N}</w:t>
+            <w:pPr>
+              <w:spacing w:before="120" w:after="120"/>
+              <w:jc w:val="center"/>
+              <w:rPr>
+                <w:rFonts w:ascii="Arial" w:hAnsi="Arial" w:cs="Arial"/>
+                <w:sz w:val="20"/>
+                <w:szCs w:val="20"/>
+                <w:lang w:val="de-DE"/>
+              </w:rPr>
+            </w:pPr>
+            <w:r>
+              <w:rPr>
+                <w:rFonts w:ascii="Arial" w:hAnsi="Arial" w:cs="Arial"/>
+                <w:b/>
+                <w:bCs/>
+                <w:sz w:val="20"/>
+                <w:szCs w:val="20"/>
+                <w:lang w:val="de-DE"/>
+              </w:rPr>
+              <w:t>B</w:t>
+            </w:r>
+            <w:r>
+              <w:rPr>
+                <w:rFonts w:ascii="Arial" w:hAnsi="Arial" w:cs="Arial"/>
+                <w:b/>
+                <w:bCs/>
+                <w:sz w:val="20"/>
+                <w:szCs w:val="20"/>
+                <w:vertAlign w:val="subscript"/>
+                <w:lang w:val="de-DE"/>
+              </w:rPr>
+              <w:t>1</w:t>
+            </w:r>
+            <w:r>
+              <w:rPr>
+                <w:rFonts w:ascii="Arial" w:hAnsi="Arial" w:cs="Arial"/>
+                <w:b/>
+                <w:bCs/>
+                <w:sz w:val="20"/>
+                <w:szCs w:val="20"/>
+                <w:lang w:val="de-DE"/>
+              </w:rPr>
+              <w:t>N</w:t>
+            </w:r>
+          </w:p>
+          <w:p>
+            <w:r>
+              <w:rPr>
+                <w:rFonts w:ascii="Arial" w:hAnsi="Arial" w:cs="Arial"/>
+                <w:b/>
+                <w:bCs/>
+                <w:sz w:val="56"/>
+                <w:szCs w:val="56"/>
+              </w:rPr>
+              <w:t xml:space="preserve">{mark_B1N}</w:t>
             </w:r>
           </w:p>
         </w:tc>
@@ -966,58 +975,57 @@
             <w:tcW w:w="786" w:type="dxa"/>
           </w:tcPr>
           <w:p>
-            <w:r>
-              <w:rPr>
-                <w:rFonts w:ascii="Arial" w:hAnsi="Arial" w:cs="Arial"/>
-                <w:sz w:val="20"/>
-                <w:szCs w:val="20"/>
-              </w:rPr>
-              <w:t xml:space="preserve">{^unused_B2N}</w:t>
-            </w:r>
-            <w:r>
-              <w:rPr>
-                <w:rFonts w:ascii="Arial" w:hAnsi="Arial" w:cs="Arial"/>
-                <w:b/>
-                <w:bCs/>
-                <w:sz w:val="20"/>
-                <w:szCs w:val="20"/>
-              </w:rPr>
-              <w:t xml:space="preserve">B2N</w:t>
-            </w:r>
-            <w:r>
-              <w:rPr>
-                <w:rFonts w:ascii="Arial" w:hAnsi="Arial" w:cs="Arial"/>
-                <w:sz w:val="20"/>
-                <w:szCs w:val="20"/>
-              </w:rPr>
-              <w:t xml:space="preserve">{/unused_B2N}</w:t>
-            </w:r>
-            <w:r>
-              <w:rPr>
-                <w:rFonts w:ascii="Arial" w:hAnsi="Arial" w:cs="Arial"/>
-                <w:sz w:val="20"/>
-                <w:szCs w:val="20"/>
-              </w:rPr>
-              <w:t xml:space="preserve">{#unused_B2N}</w:t>
-            </w:r>
-            <w:r>
-              <w:rPr>
-                <w:rFonts w:ascii="Arial" w:hAnsi="Arial" w:cs="Arial"/>
-                <w:b/>
-                <w:bCs/>
-                <w:strike/>
-                <w:sz w:val="20"/>
-                <w:szCs w:val="20"/>
-              </w:rPr>
-              <w:t xml:space="preserve">B2N</w:t>
-            </w:r>
-            <w:r>
-              <w:rPr>
-                <w:rFonts w:ascii="Arial" w:hAnsi="Arial" w:cs="Arial"/>
-                <w:sz w:val="20"/>
-                <w:szCs w:val="20"/>
-              </w:rPr>
-              <w:t xml:space="preserve">{/unused_B2N}</w:t>
+            <w:pPr>
+              <w:spacing w:before="120" w:after="120"/>
+              <w:jc w:val="center"/>
+              <w:rPr>
+                <w:rFonts w:ascii="Arial" w:hAnsi="Arial" w:cs="Arial"/>
+                <w:sz w:val="20"/>
+                <w:szCs w:val="20"/>
+              </w:rPr>
+            </w:pPr>
+            <w:r>
+              <w:rPr>
+                <w:rFonts w:ascii="Arial" w:hAnsi="Arial" w:cs="Arial"/>
+                <w:b/>
+                <w:bCs/>
+                <w:sz w:val="20"/>
+                <w:szCs w:val="20"/>
+              </w:rPr>
+              <w:t>B</w:t>
+            </w:r>
+            <w:r>
+              <w:rPr>
+                <w:rFonts w:ascii="Arial" w:hAnsi="Arial" w:cs="Arial"/>
+                <w:b/>
+                <w:bCs/>
+                <w:sz w:val="20"/>
+                <w:szCs w:val="20"/>
+                <w:vertAlign w:val="subscript"/>
+              </w:rPr>
+              <w:t>2</w:t>
+            </w:r>
+            <w:r>
+              <w:rPr>
+                <w:rFonts w:ascii="Arial" w:hAnsi="Arial" w:cs="Arial"/>
+                <w:b/>
+                <w:bCs/>
+                <w:sz w:val="20"/>
+                <w:szCs w:val="20"/>
+              </w:rPr>
+              <w:t>N</w:t>
+            </w:r>
+          </w:p>
+          <w:p>
+            <w:r>
+              <w:rPr>
+                <w:rFonts w:ascii="Arial" w:hAnsi="Arial" w:cs="Arial"/>
+                <w:b/>
+                <w:bCs/>
+                <w:sz w:val="56"/>
+                <w:szCs w:val="56"/>
+              </w:rPr>
+              <w:t xml:space="preserve">{mark_B2N}</w:t>
             </w:r>
           </w:p>
         </w:tc>
@@ -1026,58 +1034,57 @@
             <w:tcW w:w="786" w:type="dxa"/>
           </w:tcPr>
           <w:p>
-            <w:r>
-              <w:rPr>
-                <w:rFonts w:ascii="Arial" w:hAnsi="Arial" w:cs="Arial"/>
-                <w:sz w:val="20"/>
-                <w:szCs w:val="20"/>
-              </w:rPr>
-              <w:t xml:space="preserve">{^unused_H1N}</w:t>
-            </w:r>
-            <w:r>
-              <w:rPr>
-                <w:rFonts w:ascii="Arial" w:hAnsi="Arial" w:cs="Arial"/>
-                <w:b/>
-                <w:bCs/>
-                <w:sz w:val="20"/>
-                <w:szCs w:val="20"/>
-              </w:rPr>
-              <w:t xml:space="preserve">H1N</w:t>
-            </w:r>
-            <w:r>
-              <w:rPr>
-                <w:rFonts w:ascii="Arial" w:hAnsi="Arial" w:cs="Arial"/>
-                <w:sz w:val="20"/>
-                <w:szCs w:val="20"/>
-              </w:rPr>
-              <w:t xml:space="preserve">{/unused_H1N}</w:t>
-            </w:r>
-            <w:r>
-              <w:rPr>
-                <w:rFonts w:ascii="Arial" w:hAnsi="Arial" w:cs="Arial"/>
-                <w:sz w:val="20"/>
-                <w:szCs w:val="20"/>
-              </w:rPr>
-              <w:t xml:space="preserve">{#unused_H1N}</w:t>
-            </w:r>
-            <w:r>
-              <w:rPr>
-                <w:rFonts w:ascii="Arial" w:hAnsi="Arial" w:cs="Arial"/>
-                <w:b/>
-                <w:bCs/>
-                <w:strike/>
-                <w:sz w:val="20"/>
-                <w:szCs w:val="20"/>
-              </w:rPr>
-              <w:t xml:space="preserve">H1N</w:t>
-            </w:r>
-            <w:r>
-              <w:rPr>
-                <w:rFonts w:ascii="Arial" w:hAnsi="Arial" w:cs="Arial"/>
-                <w:sz w:val="20"/>
-                <w:szCs w:val="20"/>
-              </w:rPr>
-              <w:t xml:space="preserve">{/unused_H1N}</w:t>
+            <w:pPr>
+              <w:spacing w:before="120" w:after="120"/>
+              <w:jc w:val="center"/>
+              <w:rPr>
+                <w:rFonts w:ascii="Arial" w:hAnsi="Arial" w:cs="Arial"/>
+                <w:sz w:val="20"/>
+                <w:szCs w:val="20"/>
+              </w:rPr>
+            </w:pPr>
+            <w:r>
+              <w:rPr>
+                <w:rFonts w:ascii="Arial" w:hAnsi="Arial" w:cs="Arial"/>
+                <w:b/>
+                <w:bCs/>
+                <w:sz w:val="20"/>
+                <w:szCs w:val="20"/>
+              </w:rPr>
+              <w:t>H</w:t>
+            </w:r>
+            <w:r>
+              <w:rPr>
+                <w:rFonts w:ascii="Arial" w:hAnsi="Arial" w:cs="Arial"/>
+                <w:b/>
+                <w:bCs/>
+                <w:sz w:val="20"/>
+                <w:szCs w:val="20"/>
+                <w:vertAlign w:val="subscript"/>
+              </w:rPr>
+              <w:t>1</w:t>
+            </w:r>
+            <w:r>
+              <w:rPr>
+                <w:rFonts w:ascii="Arial" w:hAnsi="Arial" w:cs="Arial"/>
+                <w:b/>
+                <w:bCs/>
+                <w:sz w:val="20"/>
+                <w:szCs w:val="20"/>
+              </w:rPr>
+              <w:t>N</w:t>
+            </w:r>
+          </w:p>
+          <w:p>
+            <w:r>
+              <w:rPr>
+                <w:rFonts w:ascii="Arial" w:hAnsi="Arial" w:cs="Arial"/>
+                <w:b/>
+                <w:bCs/>
+                <w:sz w:val="56"/>
+                <w:szCs w:val="56"/>
+              </w:rPr>
+              <w:t xml:space="preserve">{mark_H1N}</w:t>
             </w:r>
           </w:p>
         </w:tc>
@@ -1086,58 +1093,57 @@
             <w:tcW w:w="521" w:type="dxa"/>
           </w:tcPr>
           <w:p>
-            <w:r>
-              <w:rPr>
-                <w:rFonts w:ascii="Arial" w:hAnsi="Arial" w:cs="Arial"/>
-                <w:sz w:val="20"/>
-                <w:szCs w:val="20"/>
-              </w:rPr>
-              <w:t xml:space="preserve">{^unused_H2N}</w:t>
-            </w:r>
-            <w:r>
-              <w:rPr>
-                <w:rFonts w:ascii="Arial" w:hAnsi="Arial" w:cs="Arial"/>
-                <w:b/>
-                <w:bCs/>
-                <w:sz w:val="20"/>
-                <w:szCs w:val="20"/>
-              </w:rPr>
-              <w:t xml:space="preserve">H2N</w:t>
-            </w:r>
-            <w:r>
-              <w:rPr>
-                <w:rFonts w:ascii="Arial" w:hAnsi="Arial" w:cs="Arial"/>
-                <w:sz w:val="20"/>
-                <w:szCs w:val="20"/>
-              </w:rPr>
-              <w:t xml:space="preserve">{/unused_H2N}</w:t>
-            </w:r>
-            <w:r>
-              <w:rPr>
-                <w:rFonts w:ascii="Arial" w:hAnsi="Arial" w:cs="Arial"/>
-                <w:sz w:val="20"/>
-                <w:szCs w:val="20"/>
-              </w:rPr>
-              <w:t xml:space="preserve">{#unused_H2N}</w:t>
-            </w:r>
-            <w:r>
-              <w:rPr>
-                <w:rFonts w:ascii="Arial" w:hAnsi="Arial" w:cs="Arial"/>
-                <w:b/>
-                <w:bCs/>
-                <w:strike/>
-                <w:sz w:val="20"/>
-                <w:szCs w:val="20"/>
-              </w:rPr>
-              <w:t xml:space="preserve">H2N</w:t>
-            </w:r>
-            <w:r>
-              <w:rPr>
-                <w:rFonts w:ascii="Arial" w:hAnsi="Arial" w:cs="Arial"/>
-                <w:sz w:val="20"/>
-                <w:szCs w:val="20"/>
-              </w:rPr>
-              <w:t xml:space="preserve">{/unused_H2N}</w:t>
+            <w:pPr>
+              <w:spacing w:before="120" w:after="120"/>
+              <w:jc w:val="center"/>
+              <w:rPr>
+                <w:rFonts w:ascii="Arial" w:hAnsi="Arial" w:cs="Arial"/>
+                <w:sz w:val="20"/>
+                <w:szCs w:val="20"/>
+              </w:rPr>
+            </w:pPr>
+            <w:r>
+              <w:rPr>
+                <w:rFonts w:ascii="Arial" w:hAnsi="Arial" w:cs="Arial"/>
+                <w:b/>
+                <w:bCs/>
+                <w:sz w:val="20"/>
+                <w:szCs w:val="20"/>
+              </w:rPr>
+              <w:t>H</w:t>
+            </w:r>
+            <w:r>
+              <w:rPr>
+                <w:rFonts w:ascii="Arial" w:hAnsi="Arial" w:cs="Arial"/>
+                <w:b/>
+                <w:bCs/>
+                <w:sz w:val="20"/>
+                <w:szCs w:val="20"/>
+                <w:vertAlign w:val="subscript"/>
+              </w:rPr>
+              <w:t>2</w:t>
+            </w:r>
+            <w:r>
+              <w:rPr>
+                <w:rFonts w:ascii="Arial" w:hAnsi="Arial" w:cs="Arial"/>
+                <w:b/>
+                <w:bCs/>
+                <w:sz w:val="20"/>
+                <w:szCs w:val="20"/>
+              </w:rPr>
+              <w:t>N</w:t>
+            </w:r>
+          </w:p>
+          <w:p>
+            <w:r>
+              <w:rPr>
+                <w:rFonts w:ascii="Arial" w:hAnsi="Arial" w:cs="Arial"/>
+                <w:b/>
+                <w:bCs/>
+                <w:sz w:val="56"/>
+                <w:szCs w:val="56"/>
+              </w:rPr>
+              <w:t xml:space="preserve">{mark_H2N}</w:t>
             </w:r>
           </w:p>
         </w:tc>

</xml_diff>

<commit_message>
Replace the X mark with a diagonal line across the whole cell
The symbol itself is never touched - only the cell around it. For each
symbol NOT requested, a diagonal border is drawn across its entire cell
in the legend table; the requested symbol(s) keep a plain cell. This
replaces the earlier bold "X" character, which was sitting awkwardly on
top of/below the symbol instead of marking the cell as a whole.

Implementation: this is done as a post-processing pass on the finished
document (server/services/habilitationRequestDocx.ts), operating
directly on the OOXML table cell borders (<w:tcBorders><w:tl2br/>),
since neither docxtemplater's tag substitution nor the `docx` library
expose diagonal cell borders. It applies identically to the real ST
template and the from-scratch HT document, keyed off the fixed
[label, 8 symbols] row layout both share.

Co-Authored-By: Claude Sonnet 5 <noreply@anthropic.com>
Claude-Session: https://claude.ai/code/session_01Vv9yTc5WTYyhneR3pGmzMX
</commit_message>
<xml_diff>
--- a/server/templates/annexe_ST.docx
+++ b/server/templates/annexe_ST.docx
@@ -707,16 +707,51 @@
               <w:t>T</w:t>
             </w:r>
           </w:p>
+        </w:tc>
+        <w:tc>
+          <w:tcPr>
+            <w:tcW w:w="786" w:type="dxa"/>
+          </w:tcPr>
           <w:p>
-            <w:r>
-              <w:rPr>
-                <w:rFonts w:ascii="Arial" w:hAnsi="Arial" w:cs="Arial"/>
-                <w:b/>
-                <w:bCs/>
-                <w:sz w:val="56"/>
-                <w:szCs w:val="56"/>
-              </w:rPr>
-              <w:t xml:space="preserve">{mark_B1T}</w:t>
+            <w:pPr>
+              <w:spacing w:before="120" w:after="120"/>
+              <w:jc w:val="center"/>
+              <w:rPr>
+                <w:rFonts w:ascii="Arial" w:hAnsi="Arial" w:cs="Arial"/>
+                <w:sz w:val="20"/>
+                <w:szCs w:val="20"/>
+              </w:rPr>
+            </w:pPr>
+            <w:r>
+              <w:rPr>
+                <w:rFonts w:ascii="Arial" w:hAnsi="Arial" w:cs="Arial"/>
+                <w:b/>
+                <w:bCs/>
+                <w:sz w:val="20"/>
+                <w:szCs w:val="20"/>
+              </w:rPr>
+              <w:t>B</w:t>
+            </w:r>
+            <w:r>
+              <w:rPr>
+                <w:rFonts w:ascii="Arial" w:hAnsi="Arial" w:cs="Arial"/>
+                <w:b/>
+                <w:bCs/>
+                <w:sz w:val="20"/>
+                <w:szCs w:val="20"/>
+                <w:vertAlign w:val="subscript"/>
+              </w:rPr>
+              <w:t>2</w:t>
+            </w:r>
+            <w:r>
+              <w:rPr>
+                <w:rFonts w:ascii="Arial" w:hAnsi="Arial" w:cs="Arial"/>
+                <w:b/>
+                <w:bCs/>
+                <w:sz w:val="20"/>
+                <w:szCs w:val="20"/>
+              </w:rPr>
+              <w:t>T</w:t>
             </w:r>
           </w:p>
         </w:tc>
@@ -732,6 +767,7 @@
                 <w:rFonts w:ascii="Arial" w:hAnsi="Arial" w:cs="Arial"/>
                 <w:sz w:val="20"/>
                 <w:szCs w:val="20"/>
+                <w:lang w:val="de-DE"/>
               </w:rPr>
             </w:pPr>
             <w:r>
@@ -741,8 +777,9 @@
                 <w:bCs/>
                 <w:sz w:val="20"/>
                 <w:szCs w:val="20"/>
-              </w:rPr>
-              <w:t>B</w:t>
+                <w:lang w:val="de-DE"/>
+              </w:rPr>
+              <w:t>H</w:t>
             </w:r>
             <w:r>
               <w:rPr>
@@ -752,30 +789,20 @@
                 <w:sz w:val="20"/>
                 <w:szCs w:val="20"/>
                 <w:vertAlign w:val="subscript"/>
-              </w:rPr>
-              <w:t>2</w:t>
-            </w:r>
-            <w:r>
-              <w:rPr>
-                <w:rFonts w:ascii="Arial" w:hAnsi="Arial" w:cs="Arial"/>
-                <w:b/>
-                <w:bCs/>
-                <w:sz w:val="20"/>
-                <w:szCs w:val="20"/>
+                <w:lang w:val="de-DE"/>
+              </w:rPr>
+              <w:t>1</w:t>
+            </w:r>
+            <w:r>
+              <w:rPr>
+                <w:rFonts w:ascii="Arial" w:hAnsi="Arial" w:cs="Arial"/>
+                <w:b/>
+                <w:bCs/>
+                <w:sz w:val="20"/>
+                <w:szCs w:val="20"/>
+                <w:lang w:val="de-DE"/>
               </w:rPr>
               <w:t>T</w:t>
-            </w:r>
-          </w:p>
-          <w:p>
-            <w:r>
-              <w:rPr>
-                <w:rFonts w:ascii="Arial" w:hAnsi="Arial" w:cs="Arial"/>
-                <w:b/>
-                <w:bCs/>
-                <w:sz w:val="56"/>
-                <w:szCs w:val="56"/>
-              </w:rPr>
-              <w:t xml:space="preserve">{mark_B2T}</w:t>
             </w:r>
           </w:p>
         </w:tc>
@@ -789,6 +816,8 @@
               <w:jc w:val="center"/>
               <w:rPr>
                 <w:rFonts w:ascii="Arial" w:hAnsi="Arial" w:cs="Arial"/>
+                <w:b/>
+                <w:bCs/>
                 <w:sz w:val="20"/>
                 <w:szCs w:val="20"/>
                 <w:lang w:val="de-DE"/>
@@ -815,7 +844,7 @@
                 <w:vertAlign w:val="subscript"/>
                 <w:lang w:val="de-DE"/>
               </w:rPr>
-              <w:t>1</w:t>
+              <w:t>2</w:t>
             </w:r>
             <w:r>
               <w:rPr>
@@ -827,18 +856,6 @@
                 <w:lang w:val="de-DE"/>
               </w:rPr>
               <w:t>T</w:t>
-            </w:r>
-          </w:p>
-          <w:p>
-            <w:r>
-              <w:rPr>
-                <w:rFonts w:ascii="Arial" w:hAnsi="Arial" w:cs="Arial"/>
-                <w:b/>
-                <w:bCs/>
-                <w:sz w:val="56"/>
-                <w:szCs w:val="56"/>
-              </w:rPr>
-              <w:t xml:space="preserve">{mark_H1T}</w:t>
             </w:r>
           </w:p>
         </w:tc>
@@ -852,8 +869,6 @@
               <w:jc w:val="center"/>
               <w:rPr>
                 <w:rFonts w:ascii="Arial" w:hAnsi="Arial" w:cs="Arial"/>
-                <w:b/>
-                <w:bCs/>
                 <w:sz w:val="20"/>
                 <w:szCs w:val="20"/>
                 <w:lang w:val="de-DE"/>
@@ -868,7 +883,7 @@
                 <w:szCs w:val="20"/>
                 <w:lang w:val="de-DE"/>
               </w:rPr>
-              <w:t>H</w:t>
+              <w:t>B</w:t>
             </w:r>
             <w:r>
               <w:rPr>
@@ -880,7 +895,7 @@
                 <w:vertAlign w:val="subscript"/>
                 <w:lang w:val="de-DE"/>
               </w:rPr>
-              <w:t>2</w:t>
+              <w:t>1</w:t>
             </w:r>
             <w:r>
               <w:rPr>
@@ -891,19 +906,7 @@
                 <w:szCs w:val="20"/>
                 <w:lang w:val="de-DE"/>
               </w:rPr>
-              <w:t>T</w:t>
-            </w:r>
-          </w:p>
-          <w:p>
-            <w:r>
-              <w:rPr>
-                <w:rFonts w:ascii="Arial" w:hAnsi="Arial" w:cs="Arial"/>
-                <w:b/>
-                <w:bCs/>
-                <w:sz w:val="56"/>
-                <w:szCs w:val="56"/>
-              </w:rPr>
-              <w:t xml:space="preserve">{mark_H2T}</w:t>
+              <w:t>N</w:t>
             </w:r>
           </w:p>
         </w:tc>
@@ -919,7 +922,6 @@
                 <w:rFonts w:ascii="Arial" w:hAnsi="Arial" w:cs="Arial"/>
                 <w:sz w:val="20"/>
                 <w:szCs w:val="20"/>
-                <w:lang w:val="de-DE"/>
               </w:rPr>
             </w:pPr>
             <w:r>
@@ -929,7 +931,6 @@
                 <w:bCs/>
                 <w:sz w:val="20"/>
                 <w:szCs w:val="20"/>
-                <w:lang w:val="de-DE"/>
               </w:rPr>
               <w:t>B</w:t>
             </w:r>
@@ -941,32 +942,18 @@
                 <w:sz w:val="20"/>
                 <w:szCs w:val="20"/>
                 <w:vertAlign w:val="subscript"/>
-                <w:lang w:val="de-DE"/>
-              </w:rPr>
-              <w:t>1</w:t>
-            </w:r>
-            <w:r>
-              <w:rPr>
-                <w:rFonts w:ascii="Arial" w:hAnsi="Arial" w:cs="Arial"/>
-                <w:b/>
-                <w:bCs/>
-                <w:sz w:val="20"/>
-                <w:szCs w:val="20"/>
-                <w:lang w:val="de-DE"/>
+              </w:rPr>
+              <w:t>2</w:t>
+            </w:r>
+            <w:r>
+              <w:rPr>
+                <w:rFonts w:ascii="Arial" w:hAnsi="Arial" w:cs="Arial"/>
+                <w:b/>
+                <w:bCs/>
+                <w:sz w:val="20"/>
+                <w:szCs w:val="20"/>
               </w:rPr>
               <w:t>N</w:t>
-            </w:r>
-          </w:p>
-          <w:p>
-            <w:r>
-              <w:rPr>
-                <w:rFonts w:ascii="Arial" w:hAnsi="Arial" w:cs="Arial"/>
-                <w:b/>
-                <w:bCs/>
-                <w:sz w:val="56"/>
-                <w:szCs w:val="56"/>
-              </w:rPr>
-              <w:t xml:space="preserve">{mark_B1N}</w:t>
             </w:r>
           </w:p>
         </w:tc>
@@ -992,7 +979,7 @@
                 <w:sz w:val="20"/>
                 <w:szCs w:val="20"/>
               </w:rPr>
-              <w:t>B</w:t>
+              <w:t>H</w:t>
             </w:r>
             <w:r>
               <w:rPr>
@@ -1003,7 +990,7 @@
                 <w:szCs w:val="20"/>
                 <w:vertAlign w:val="subscript"/>
               </w:rPr>
-              <w:t>2</w:t>
+              <w:t>1</w:t>
             </w:r>
             <w:r>
               <w:rPr>
@@ -1014,77 +1001,6 @@
                 <w:szCs w:val="20"/>
               </w:rPr>
               <w:t>N</w:t>
-            </w:r>
-          </w:p>
-          <w:p>
-            <w:r>
-              <w:rPr>
-                <w:rFonts w:ascii="Arial" w:hAnsi="Arial" w:cs="Arial"/>
-                <w:b/>
-                <w:bCs/>
-                <w:sz w:val="56"/>
-                <w:szCs w:val="56"/>
-              </w:rPr>
-              <w:t xml:space="preserve">{mark_B2N}</w:t>
-            </w:r>
-          </w:p>
-        </w:tc>
-        <w:tc>
-          <w:tcPr>
-            <w:tcW w:w="786" w:type="dxa"/>
-          </w:tcPr>
-          <w:p>
-            <w:pPr>
-              <w:spacing w:before="120" w:after="120"/>
-              <w:jc w:val="center"/>
-              <w:rPr>
-                <w:rFonts w:ascii="Arial" w:hAnsi="Arial" w:cs="Arial"/>
-                <w:sz w:val="20"/>
-                <w:szCs w:val="20"/>
-              </w:rPr>
-            </w:pPr>
-            <w:r>
-              <w:rPr>
-                <w:rFonts w:ascii="Arial" w:hAnsi="Arial" w:cs="Arial"/>
-                <w:b/>
-                <w:bCs/>
-                <w:sz w:val="20"/>
-                <w:szCs w:val="20"/>
-              </w:rPr>
-              <w:t>H</w:t>
-            </w:r>
-            <w:r>
-              <w:rPr>
-                <w:rFonts w:ascii="Arial" w:hAnsi="Arial" w:cs="Arial"/>
-                <w:b/>
-                <w:bCs/>
-                <w:sz w:val="20"/>
-                <w:szCs w:val="20"/>
-                <w:vertAlign w:val="subscript"/>
-              </w:rPr>
-              <w:t>1</w:t>
-            </w:r>
-            <w:r>
-              <w:rPr>
-                <w:rFonts w:ascii="Arial" w:hAnsi="Arial" w:cs="Arial"/>
-                <w:b/>
-                <w:bCs/>
-                <w:sz w:val="20"/>
-                <w:szCs w:val="20"/>
-              </w:rPr>
-              <w:t>N</w:t>
-            </w:r>
-          </w:p>
-          <w:p>
-            <w:r>
-              <w:rPr>
-                <w:rFonts w:ascii="Arial" w:hAnsi="Arial" w:cs="Arial"/>
-                <w:b/>
-                <w:bCs/>
-                <w:sz w:val="56"/>
-                <w:szCs w:val="56"/>
-              </w:rPr>
-              <w:t xml:space="preserve">{mark_H1N}</w:t>
             </w:r>
           </w:p>
         </w:tc>
@@ -1132,18 +1048,6 @@
                 <w:szCs w:val="20"/>
               </w:rPr>
               <w:t>N</w:t>
-            </w:r>
-          </w:p>
-          <w:p>
-            <w:r>
-              <w:rPr>
-                <w:rFonts w:ascii="Arial" w:hAnsi="Arial" w:cs="Arial"/>
-                <w:b/>
-                <w:bCs/>
-                <w:sz w:val="56"/>
-                <w:szCs w:val="56"/>
-              </w:rPr>
-              <w:t xml:space="preserve">{mark_H2N}</w:t>
             </w:r>
           </w:p>
         </w:tc>

</xml_diff>